<commit_message>
feat: update the year of education
</commit_message>
<xml_diff>
--- a/public/cv/Daves Piedad.docx
+++ b/public/cv/Daves Piedad.docx
@@ -1102,8 +1102,6 @@
         </w:rPr>
         <w:t>nd performance so memorial page</w:t>
       </w:r>
-      <w:bookmarkStart w:id="0" w:name="_GoBack"/>
-      <w:bookmarkEnd w:id="0"/>
       <w:r>
         <w:rPr>
           <w:color w:val="000000" w:themeColor="text1"/>
@@ -1216,69 +1214,56 @@
     <w:p>
       <w:pPr>
         <w:pStyle w:val="NoSpacing"/>
-        <w:spacing w:after="240"/>
-        <w:rPr>
-          <w:color w:val="000000" w:themeColor="text1"/>
-        </w:rPr>
-      </w:pPr>
-      <w:r>
-        <w:rPr>
-          <w:color w:val="000000" w:themeColor="text1"/>
-        </w:rPr>
-        <w:t xml:space="preserve">- </w:t>
-      </w:r>
-      <w:r>
-        <w:rPr>
-          <w:color w:val="000000" w:themeColor="text1"/>
-        </w:rPr>
-        <w:t xml:space="preserve">Built and maintained backend services for </w:t>
-      </w:r>
-      <w:proofErr w:type="spellStart"/>
-      <w:r>
-        <w:rPr>
-          <w:color w:val="000000" w:themeColor="text1"/>
-        </w:rPr>
-        <w:t>AlphaSwap’s</w:t>
-      </w:r>
-      <w:proofErr w:type="spellEnd"/>
-      <w:r>
-        <w:rPr>
-          <w:color w:val="000000" w:themeColor="text1"/>
-        </w:rPr>
-        <w:t xml:space="preserve"> Data-as-a-Service platform using </w:t>
-      </w:r>
-      <w:r>
         <w:rPr>
           <w:b/>
           <w:color w:val="000000" w:themeColor="text1"/>
         </w:rPr>
-        <w:t>Nest</w:t>
-      </w:r>
+      </w:pPr>
       <w:r>
         <w:rPr>
           <w:color w:val="000000" w:themeColor="text1"/>
         </w:rPr>
-        <w:t>.</w:t>
+        <w:t xml:space="preserve">- </w:t>
+      </w:r>
+      <w:r>
+        <w:rPr>
+          <w:color w:val="000000" w:themeColor="text1"/>
+        </w:rPr>
+        <w:t xml:space="preserve">Built and maintained backend services for </w:t>
+      </w:r>
+      <w:proofErr w:type="spellStart"/>
+      <w:r>
+        <w:rPr>
+          <w:color w:val="000000" w:themeColor="text1"/>
+        </w:rPr>
+        <w:t>AlphaSwap’s</w:t>
+      </w:r>
+      <w:proofErr w:type="spellEnd"/>
+      <w:r>
+        <w:rPr>
+          <w:color w:val="000000" w:themeColor="text1"/>
+        </w:rPr>
+        <w:t xml:space="preserve"> Data-as-a-Service platform using </w:t>
       </w:r>
       <w:r>
         <w:rPr>
           <w:b/>
           <w:color w:val="000000" w:themeColor="text1"/>
         </w:rPr>
-        <w:t>js</w:t>
+        <w:t>Nest</w:t>
       </w:r>
       <w:r>
         <w:rPr>
           <w:color w:val="000000" w:themeColor="text1"/>
         </w:rPr>
-        <w:t xml:space="preserve">, </w:t>
+        <w:t>.</w:t>
       </w:r>
       <w:r>
         <w:rPr>
           <w:b/>
           <w:color w:val="000000" w:themeColor="text1"/>
         </w:rPr>
-        <w:t>PostgreSQL</w:t>
+        <w:t>js</w:t>
       </w:r>
       <w:r>
         <w:rPr>
@@ -1291,47 +1276,60 @@
           <w:b/>
           <w:color w:val="000000" w:themeColor="text1"/>
         </w:rPr>
-        <w:t>REST</w:t>
+        <w:t>PostgreSQL</w:t>
       </w:r>
       <w:r>
         <w:rPr>
           <w:color w:val="000000" w:themeColor="text1"/>
         </w:rPr>
-        <w:t xml:space="preserve"> </w:t>
+        <w:t xml:space="preserve">, </w:t>
       </w:r>
       <w:r>
         <w:rPr>
           <w:b/>
           <w:color w:val="000000" w:themeColor="text1"/>
         </w:rPr>
-        <w:t>APIs</w:t>
+        <w:t>REST</w:t>
       </w:r>
       <w:r>
         <w:rPr>
           <w:color w:val="000000" w:themeColor="text1"/>
         </w:rPr>
-        <w:t xml:space="preserve">, and </w:t>
-      </w:r>
-      <w:proofErr w:type="spellStart"/>
+        <w:t xml:space="preserve"> </w:t>
+      </w:r>
       <w:r>
         <w:rPr>
           <w:b/>
           <w:color w:val="000000" w:themeColor="text1"/>
         </w:rPr>
-        <w:t>GraphQL</w:t>
-      </w:r>
-      <w:proofErr w:type="spellEnd"/>
+        <w:t>APIs</w:t>
+      </w:r>
       <w:r>
         <w:rPr>
           <w:color w:val="000000" w:themeColor="text1"/>
         </w:rPr>
-        <w:t xml:space="preserve">, improving data processing consistency for investment workflows by </w:t>
-      </w:r>
+        <w:t xml:space="preserve">, and </w:t>
+      </w:r>
+      <w:proofErr w:type="spellStart"/>
       <w:r>
         <w:rPr>
           <w:b/>
           <w:color w:val="000000" w:themeColor="text1"/>
         </w:rPr>
+        <w:t>GraphQL</w:t>
+      </w:r>
+      <w:proofErr w:type="spellEnd"/>
+      <w:r>
+        <w:rPr>
+          <w:color w:val="000000" w:themeColor="text1"/>
+        </w:rPr>
+        <w:t xml:space="preserve">, improving data processing consistency for investment workflows by </w:t>
+      </w:r>
+      <w:r>
+        <w:rPr>
+          <w:b/>
+          <w:color w:val="000000" w:themeColor="text1"/>
+        </w:rPr>
         <w:t>24%.</w:t>
       </w:r>
       <w:r>
@@ -1451,6 +1449,21 @@
           <w:color w:val="000000" w:themeColor="text1"/>
         </w:rPr>
         <w:t xml:space="preserve">18%. </w:t>
+      </w:r>
+    </w:p>
+    <w:p>
+      <w:pPr>
+        <w:pStyle w:val="NoSpacing"/>
+        <w:spacing w:after="240"/>
+        <w:rPr>
+          <w:color w:val="000000" w:themeColor="text1"/>
+        </w:rPr>
+      </w:pPr>
+      <w:r>
+        <w:rPr>
+          <w:color w:val="000000" w:themeColor="text1"/>
+        </w:rPr>
+        <w:t xml:space="preserve">- </w:t>
       </w:r>
       <w:r>
         <w:rPr>
@@ -1483,14 +1496,28 @@
       </w:r>
     </w:p>
     <w:p>
-      <w:r>
+      <w:pPr>
+        <w:spacing w:after="0" w:line="240" w:lineRule="auto"/>
+        <w:rPr>
+          <w:sz w:val="28"/>
+        </w:rPr>
+      </w:pPr>
+      <w:r>
+        <w:rPr>
+          <w:sz w:val="28"/>
+        </w:rPr>
         <w:t>Manila Central University</w:t>
       </w:r>
     </w:p>
     <w:p>
       <w:r>
-        <w:t>Bachelor of Computer Science | Aug 2015 – May 2018</w:t>
-      </w:r>
+        <w:t>Bachelor of Computer Science | Aug 201</w:t>
+      </w:r>
+      <w:r>
+        <w:t>3 – May 2017</w:t>
+      </w:r>
+      <w:bookmarkStart w:id="0" w:name="_GoBack"/>
+      <w:bookmarkEnd w:id="0"/>
     </w:p>
     <w:sectPr>
       <w:pgSz w:w="12240" w:h="15840"/>
@@ -13039,7 +13066,7 @@
 </file>
 
 <file path=customXml/itemProps2.xml><?xml version="1.0" encoding="utf-8"?>
-<ds:datastoreItem xmlns:ds="http://schemas.openxmlformats.org/officeDocument/2006/customXml" ds:itemID="{81C7FFAB-EB59-4DBF-BDE0-573CC98F883C}">
+<ds:datastoreItem xmlns:ds="http://schemas.openxmlformats.org/officeDocument/2006/customXml" ds:itemID="{D1D8E968-9158-4E92-9C3D-CD6655757883}">
   <ds:schemaRefs>
     <ds:schemaRef ds:uri="http://schemas.openxmlformats.org/officeDocument/2006/bibliography"/>
   </ds:schemaRefs>

</xml_diff>